<commit_message>
Replace UBUMWE and IHURIRO contract logos
Trimmed the new PNG logos and enlarged them in the contract templates.

Co-Authored-By: Claude Opus 5.5 <noreply@anthropic.com>
</commit_message>
<xml_diff>
--- a/server/templates/contract-ihuriro.docx
+++ b/server/templates/contract-ihuriro.docx
@@ -13,7 +13,7 @@
         <w:rPr/>
         <w:drawing>
           <wp:inline distT="0" distB="0" distL="0" distR="0">
-            <wp:extent cx="4070985" cy="1354455"/>
+            <wp:extent cx="4023360" cy="1111214"/>
             <wp:effectExtent l="0" t="0" r="0" b="0"/>
             <wp:docPr id="1" name="Picture 1"/>
             <wp:cNvGraphicFramePr>
@@ -38,7 +38,7 @@
                   <pic:spPr bwMode="auto">
                     <a:xfrm>
                       <a:off x="0" y="0"/>
-                      <a:ext cx="4070985" cy="1354455"/>
+                      <a:ext cx="4023360" cy="1111214"/>
                     </a:xfrm>
                     <a:prstGeom prst="rect">
                       <a:avLst/>

</xml_diff>

<commit_message>
Use sharp redrawn logos in UBUMWE and IHURIRO contracts
The supplied PNG logos were too small to print cleanly, so both were
redrawn as vector art (saved in contract-template/*.svg) and embedded
in the contract templates as high-resolution PNGs. The IHURIRO text
now sits fully inside its oval.

Co-Authored-By: Claude Opus 5.5 <noreply@anthropic.com>
</commit_message>
<xml_diff>
--- a/server/templates/contract-ihuriro.docx
+++ b/server/templates/contract-ihuriro.docx
@@ -13,7 +13,7 @@
         <w:rPr/>
         <w:drawing>
           <wp:inline distT="0" distB="0" distL="0" distR="0">
-            <wp:extent cx="4023360" cy="1111214"/>
+            <wp:extent cx="4023360" cy="1088648"/>
             <wp:effectExtent l="0" t="0" r="0" b="0"/>
             <wp:docPr id="1" name="Picture 1"/>
             <wp:cNvGraphicFramePr>
@@ -38,7 +38,7 @@
                   <pic:spPr bwMode="auto">
                     <a:xfrm>
                       <a:off x="0" y="0"/>
-                      <a:ext cx="4023360" cy="1111214"/>
+                      <a:ext cx="4023360" cy="1088648"/>
                     </a:xfrm>
                     <a:prstGeom prst="rect">
                       <a:avLst/>

</xml_diff>